<commit_message>
export: BRD v0.12 áp định dạng giống báo cáo — Title 18pt giữa, mục lớn 16pt bold, mục con 13pt bold, body 13pt
Co-Authored-By: Claude Opus 4.8 (1M context) <noreply@anthropic.com>
</commit_message>
<xml_diff>
--- a/ba/sync/output/human/exports/BRD-TOSS-full-v0.12-2026-06-22.docx
+++ b/ba/sync/output/human/exports/BRD-TOSS-full-v0.12-2026-06-22.docx
@@ -41926,8 +41926,8 @@
       <w:b/>
       <w:bCs/>
       <w:color w:val="000000"/>
-      <w:sz w:val="24"/>
-      <w:szCs w:val="24"/>
+      <w:sz w:val="32"/>
+      <w:szCs w:val="32"/>
     </w:rPr>
   </w:style>
   <w:style w:styleId="Heading2" w:type="paragraph">
@@ -41952,8 +41952,8 @@
       <w:b/>
       <w:bCs/>
       <w:color w:val="000000"/>
-      <w:sz w:val="24"/>
-      <w:szCs w:val="24"/>
+      <w:sz w:val="32"/>
+      <w:szCs w:val="32"/>
     </w:rPr>
   </w:style>
   <w:style w:styleId="Heading3" w:type="paragraph">
@@ -41978,8 +41978,8 @@
       <w:b/>
       <w:bCs/>
       <w:color w:val="000000"/>
-      <w:sz w:val="22"/>
-      <w:szCs w:val="22"/>
+      <w:sz w:val="26"/>
+      <w:szCs w:val="26"/>
     </w:rPr>
   </w:style>
   <w:style w:styleId="Heading4" w:type="paragraph">

</xml_diff>